<commit_message>
audit for errors regular expressions fix returns mark and text for support
</commit_message>
<xml_diff>
--- a/resources/templates/support-form-standart/Дніпро.docx
+++ b/resources/templates/support-form-standart/Дніпро.docx
@@ -1190,7 +1190,51 @@
           <w:rFonts w:ascii="Times New Roman" w:hAnsi="Times New Roman"/>
           <w:noProof/>
         </w:rPr>
-        <w:t>}} (н</w:t>
+        <w:t>}}</w:t>
+      </w:r>
+      <w:r>
+        <w:rPr>
+          <w:rFonts w:ascii="Times New Roman" w:hAnsi="Times New Roman"/>
+          <w:noProof/>
+        </w:rPr>
+        <w:t xml:space="preserve">{{ </w:t>
+      </w:r>
+      <w:r>
+        <w:rPr>
+          <w:rFonts w:ascii="Times New Roman" w:hAnsi="Times New Roman"/>
+          <w:noProof/>
+          <w:lang w:val="en-US"/>
+        </w:rPr>
+        <w:t>doc</w:t>
+      </w:r>
+      <w:r>
+        <w:rPr>
+          <w:rFonts w:ascii="Times New Roman" w:hAnsi="Times New Roman"/>
+          <w:noProof/>
+        </w:rPr>
+        <w:t>.</w:t>
+      </w:r>
+      <w:r>
+        <w:rPr>
+          <w:rFonts w:ascii="Times New Roman" w:hAnsi="Times New Roman"/>
+          <w:noProof/>
+          <w:lang w:val="en-US"/>
+        </w:rPr>
+        <w:t>RET</w:t>
+      </w:r>
+      <w:r>
+        <w:rPr>
+          <w:rFonts w:ascii="Times New Roman" w:hAnsi="Times New Roman"/>
+          <w:noProof/>
+        </w:rPr>
+        <w:t>}}</w:t>
+      </w:r>
+      <w:r>
+        <w:rPr>
+          <w:rFonts w:ascii="Times New Roman" w:hAnsi="Times New Roman"/>
+          <w:noProof/>
+        </w:rPr>
+        <w:t xml:space="preserve"> (н</w:t>
       </w:r>
       <w:r>
         <w:rPr>

</xml_diff>